<commit_message>
Issue fixes on exported data
</commit_message>
<xml_diff>
--- a/resources/template/Affiliate Detail.docx
+++ b/resources/template/Affiliate Detail.docx
@@ -91,17 +91,21 @@
                           <w:p>
                             <w:pPr>
                               <w:pStyle w:val="FrameContents"/>
-                              <w:overflowPunct w:val="false"/>
+                              <w:overflowPunct w:val="true"/>
                               <w:rPr>
-                                <w:rFonts w:ascii="Calibri" w:hAnsi="Calibri" w:eastAsia="Calibri" w:cs="" w:asciiTheme="minorHAnsi" w:cstheme="minorBidi" w:eastAsiaTheme="minorHAnsi" w:hAnsiTheme="minorHAnsi"/>
+                                <w:rFonts w:ascii="Calibri" w:hAnsi="Calibri" w:eastAsia="Calibri" w:cs="Arial" w:asciiTheme="minorHAnsi" w:cstheme="minorBidi" w:eastAsiaTheme="minorHAnsi" w:hAnsiTheme="minorHAnsi"/>
                               </w:rPr>
                             </w:pPr>
                             <w:r>
-                              <w:rPr/>
+                              <w:rPr>
+                                <w:color w:val="000000"/>
+                              </w:rPr>
                               <w:t xml:space="preserve"> </w:t>
                             </w:r>
                             <w:r>
-                              <w:rPr/>
+                              <w:rPr>
+                                <w:color w:val="000000"/>
+                              </w:rPr>
                               <w:t>${IMAGE}</w:t>
                             </w:r>
                           </w:p>
@@ -126,17 +130,21 @@
                     <w:p>
                       <w:pPr>
                         <w:pStyle w:val="FrameContents"/>
-                        <w:overflowPunct w:val="false"/>
+                        <w:overflowPunct w:val="true"/>
                         <w:rPr>
-                          <w:rFonts w:ascii="Calibri" w:hAnsi="Calibri" w:eastAsia="Calibri" w:cs="" w:asciiTheme="minorHAnsi" w:cstheme="minorBidi" w:eastAsiaTheme="minorHAnsi" w:hAnsiTheme="minorHAnsi"/>
+                          <w:rFonts w:ascii="Calibri" w:hAnsi="Calibri" w:eastAsia="Calibri" w:cs="Arial" w:asciiTheme="minorHAnsi" w:cstheme="minorBidi" w:eastAsiaTheme="minorHAnsi" w:hAnsiTheme="minorHAnsi"/>
                         </w:rPr>
                       </w:pPr>
                       <w:r>
-                        <w:rPr/>
+                        <w:rPr>
+                          <w:color w:val="000000"/>
+                        </w:rPr>
                         <w:t xml:space="preserve"> </w:t>
                       </w:r>
                       <w:r>
-                        <w:rPr/>
+                        <w:rPr>
+                          <w:color w:val="000000"/>
+                        </w:rPr>
                         <w:t>${IMAGE}</w:t>
                       </w:r>
                     </w:p>
@@ -2124,27 +2132,7 @@
           <w:sz w:val="16"/>
           <w:szCs w:val="16"/>
         </w:rPr>
-        <w:t>${other_pgm</w:t>
-      </w:r>
-      <w:r>
-        <w:rPr>
-          <w:rFonts w:cs="Arial" w:ascii="Arial" w:hAnsi="Arial"/>
-          <w:b w:val="false"/>
-          <w:bCs/>
-          <w:sz w:val="16"/>
-          <w:szCs w:val="16"/>
-        </w:rPr>
-        <w:t>s</w:t>
-      </w:r>
-      <w:r>
-        <w:rPr>
-          <w:rFonts w:cs="Arial" w:ascii="Arial" w:hAnsi="Arial"/>
-          <w:b w:val="false"/>
-          <w:bCs/>
-          <w:sz w:val="16"/>
-          <w:szCs w:val="16"/>
-        </w:rPr>
-        <w:t>}</w:t>
+        <w:t>${other_pgms}</w:t>
       </w:r>
       <w:r>
         <w:rPr>
@@ -2493,19 +2481,7 @@
           <w:sz w:val="16"/>
           <w:szCs w:val="16"/>
         </w:rPr>
-        <w:t xml:space="preserve">Total Budget: </w:t>
-      </w:r>
-      <w:r>
-        <w:rPr>
-          <w:rFonts w:cs="Arial" w:ascii="Arial" w:hAnsi="Arial"/>
-          <w:b/>
-          <w:bCs/>
-          <w:i/>
-          <w:iCs/>
-          <w:sz w:val="16"/>
-          <w:szCs w:val="16"/>
-        </w:rPr>
-        <w:t>${tot_budget}</w:t>
+        <w:t>Total Budget: ${tot_budget}</w:t>
       </w:r>
     </w:p>
     <w:p>
@@ -2534,15 +2510,7 @@
           <w:sz w:val="16"/>
           <w:szCs w:val="16"/>
         </w:rPr>
-        <w:t xml:space="preserve">Budget Derived from the following sources in </w:t>
-      </w:r>
-      <w:r>
-        <w:rPr>
-          <w:rFonts w:cs="Arial" w:ascii="Arial" w:hAnsi="Arial"/>
-          <w:sz w:val="16"/>
-          <w:szCs w:val="16"/>
-        </w:rPr>
-        <w:t>${year}</w:t>
+        <w:t>Budget Derived from the following sources in ${year}</w:t>
       </w:r>
     </w:p>
     <w:p>
@@ -2913,13 +2881,6 @@
         </w:rPr>
         <w:t>Endowment:</w:t>
         <w:tab/>
-      </w:r>
-      <w:r>
-        <w:rPr>
-          <w:rFonts w:cs="Arial" w:ascii="Arial" w:hAnsi="Arial"/>
-          <w:sz w:val="16"/>
-          <w:szCs w:val="16"/>
-        </w:rPr>
         <w:t>${endv_earn}</w:t>
       </w:r>
     </w:p>
@@ -3787,16 +3748,7 @@
           <w:sz w:val="15"/>
           <w:szCs w:val="15"/>
         </w:rPr>
-        <w:t>${</w:t>
-      </w:r>
-      <w:r>
-        <w:rPr>
-          <w:rFonts w:cs="Arial" w:ascii="Arial" w:hAnsi="Arial"/>
-          <w:bCs/>
-          <w:sz w:val="15"/>
-          <w:szCs w:val="15"/>
-        </w:rPr>
-        <w:t>own</w:t>
+        <w:t>${own</w:t>
       </w:r>
       <w:r>
         <w:rPr>
@@ -3847,16 +3799,7 @@
           <w:sz w:val="16"/>
           <w:szCs w:val="16"/>
         </w:rPr>
-        <w:t>Rent</w:t>
-      </w:r>
-      <w:r>
-        <w:rPr>
-          <w:rFonts w:cs="Arial" w:ascii="Arial" w:hAnsi="Arial"/>
-          <w:bCs/>
-          <w:sz w:val="16"/>
-          <w:szCs w:val="16"/>
-        </w:rPr>
-        <w:t xml:space="preserve"> Property</w:t>
+        <w:t>Rent Property</w:t>
         <w:tab/>
       </w:r>
       <w:r>
@@ -3926,25 +3869,7 @@
           <w:sz w:val="15"/>
           <w:szCs w:val="15"/>
         </w:rPr>
-        <w:t>${</w:t>
-      </w:r>
-      <w:r>
-        <w:rPr>
-          <w:rFonts w:cs="Arial" w:ascii="Arial" w:hAnsi="Arial"/>
-          <w:bCs/>
-          <w:sz w:val="15"/>
-          <w:szCs w:val="15"/>
-        </w:rPr>
-        <w:t>pro_value</w:t>
-      </w:r>
-      <w:r>
-        <w:rPr>
-          <w:rFonts w:cs="Arial" w:ascii="Arial" w:hAnsi="Arial"/>
-          <w:bCs/>
-          <w:sz w:val="15"/>
-          <w:szCs w:val="15"/>
-        </w:rPr>
-        <w:t>}</w:t>
+        <w:t>${pro_value}</w:t>
       </w:r>
     </w:p>
     <w:p>
@@ -3986,25 +3911,7 @@
           <w:sz w:val="15"/>
           <w:szCs w:val="15"/>
         </w:rPr>
-        <w:t>${</w:t>
-      </w:r>
-      <w:r>
-        <w:rPr>
-          <w:rFonts w:cs="Arial" w:ascii="Arial" w:hAnsi="Arial"/>
-          <w:bCs/>
-          <w:sz w:val="15"/>
-          <w:szCs w:val="15"/>
-        </w:rPr>
-        <w:t>capital_budget</w:t>
-      </w:r>
-      <w:r>
-        <w:rPr>
-          <w:rFonts w:cs="Arial" w:ascii="Arial" w:hAnsi="Arial"/>
-          <w:bCs/>
-          <w:sz w:val="15"/>
-          <w:szCs w:val="15"/>
-        </w:rPr>
-        <w:t>}</w:t>
+        <w:t>${capital_budget}</w:t>
       </w:r>
     </w:p>
     <w:p>
@@ -4261,7 +4168,11 @@
         </w:rPr>
       </w:pPr>
       <w:r>
-        <w:rPr/>
+        <w:rPr>
+          <w:rFonts w:cs="Arial" w:ascii="Arial" w:hAnsi="Arial"/>
+          <w:sz w:val="16"/>
+          <w:szCs w:val="16"/>
+        </w:rPr>
       </w:r>
     </w:p>
     <w:p>
@@ -4272,32 +4183,6 @@
           <w:b/>
           <w:b/>
           <w:bCs/>
-          <w:sz w:val="16"/>
-          <w:szCs w:val="16"/>
-        </w:rPr>
-      </w:pPr>
-      <w:r>
-        <w:rPr>
-          <w:rFonts w:cs="Arial" w:ascii="Arial" w:hAnsi="Arial"/>
-          <w:b/>
-          <w:bCs/>
-          <w:sz w:val="16"/>
-          <w:szCs w:val="16"/>
-        </w:rPr>
-      </w:r>
-      <w:r>
-        <w:br w:type="page"/>
-      </w:r>
-    </w:p>
-    <w:p>
-      <w:pPr>
-        <w:pStyle w:val="Normal"/>
-        <w:tabs>
-          <w:tab w:val="clear" w:pos="720"/>
-          <w:tab w:val="left" w:pos="3600" w:leader="none"/>
-        </w:tabs>
-        <w:rPr>
-          <w:rFonts w:ascii="Arial" w:hAnsi="Arial" w:cs="Arial"/>
           <w:sz w:val="16"/>
           <w:szCs w:val="16"/>
         </w:rPr>
@@ -5165,6 +5050,7 @@
         </w:tabs>
         <w:ind w:left="1080" w:hanging="360"/>
       </w:pPr>
+      <w:rPr/>
     </w:lvl>
     <w:lvl w:ilvl="2">
       <w:start w:val="1"/>
@@ -5177,6 +5063,7 @@
         </w:tabs>
         <w:ind w:left="1440" w:hanging="360"/>
       </w:pPr>
+      <w:rPr/>
     </w:lvl>
     <w:lvl w:ilvl="3">
       <w:start w:val="1"/>
@@ -5189,6 +5076,7 @@
         </w:tabs>
         <w:ind w:left="1800" w:hanging="360"/>
       </w:pPr>
+      <w:rPr/>
     </w:lvl>
     <w:lvl w:ilvl="4">
       <w:start w:val="1"/>
@@ -5201,6 +5089,7 @@
         </w:tabs>
         <w:ind w:left="2160" w:hanging="360"/>
       </w:pPr>
+      <w:rPr/>
     </w:lvl>
     <w:lvl w:ilvl="5">
       <w:start w:val="1"/>
@@ -5213,6 +5102,7 @@
         </w:tabs>
         <w:ind w:left="2520" w:hanging="360"/>
       </w:pPr>
+      <w:rPr/>
     </w:lvl>
     <w:lvl w:ilvl="6">
       <w:start w:val="1"/>
@@ -5225,6 +5115,7 @@
         </w:tabs>
         <w:ind w:left="2880" w:hanging="360"/>
       </w:pPr>
+      <w:rPr/>
     </w:lvl>
     <w:lvl w:ilvl="7">
       <w:start w:val="1"/>
@@ -5237,6 +5128,7 @@
         </w:tabs>
         <w:ind w:left="3240" w:hanging="360"/>
       </w:pPr>
+      <w:rPr/>
     </w:lvl>
     <w:lvl w:ilvl="8">
       <w:start w:val="1"/>
@@ -5249,6 +5141,7 @@
         </w:tabs>
         <w:ind w:left="3600" w:hanging="360"/>
       </w:pPr>
+      <w:rPr/>
     </w:lvl>
   </w:abstractNum>
   <w:abstractNum w:abstractNumId="7">
@@ -5697,6 +5590,7 @@
     <w:rsid w:val="00a6634e"/>
     <w:pPr>
       <w:widowControl/>
+      <w:suppressAutoHyphens w:val="true"/>
       <w:bidi w:val="0"/>
       <w:spacing w:before="0" w:after="0"/>
       <w:jc w:val="left"/>
@@ -5933,6 +5827,7 @@
     <w:rsid w:val="003501a9"/>
     <w:pPr>
       <w:widowControl/>
+      <w:suppressAutoHyphens w:val="true"/>
       <w:bidi w:val="0"/>
       <w:spacing w:before="0" w:after="0"/>
       <w:jc w:val="left"/>

</xml_diff>